<commit_message>
Add Normativity Lab changes to website updates document
The Normativity Lab section was empty — populated it with 8 changes
covering: headshot photos, keyword research-area tags, 9 updated
member profiles from survey data, Navya Mehrotra addition, group
photo, CHAI workshop photo, broken link fixes, and pronoun display.

Co-Authored-By: Claude Opus 4.6 <noreply@anthropic.com>
Claude-Session: https://claude.ai/code/session_01EMrBifwqBFwrnxGh11cQvW
</commit_message>
<xml_diff>
--- a/Website_Content_Updates.docx
+++ b/Website_Content_Updates.docx
@@ -2050,6 +2050,660 @@
         <w:t>normativity-lab.html)</w:t>
       </w:r>
     </w:p>
+    <w:tbl>
+      <w:tblPr>
+        <w:tblW w:w="9360" w:type="dxa"/>
+        <w:tblBorders>
+          <w:top w:val="single" w:sz="4" w:space="0" w:color="auto"/>
+          <w:left w:val="single" w:sz="4" w:space="0" w:color="auto"/>
+          <w:bottom w:val="single" w:sz="4" w:space="0" w:color="auto"/>
+          <w:right w:val="single" w:sz="4" w:space="0" w:color="auto"/>
+          <w:insideH w:val="single" w:sz="4" w:space="0" w:color="auto"/>
+          <w:insideV w:val="single" w:sz="4" w:space="0" w:color="auto"/>
+        </w:tblBorders>
+        <w:tblCellMar>
+          <w:left w:w="10" w:type="dxa"/>
+          <w:right w:w="10" w:type="dxa"/>
+        </w:tblCellMar>
+        <w:tblLook w:val="04A0" w:firstRow="1" w:lastRow="0" w:firstColumn="1" w:lastColumn="0" w:noHBand="0" w:noVBand="1"/>
+      </w:tblPr>
+      <w:tblGrid>
+        <w:gridCol w:w="3500"/>
+        <w:gridCol w:w="5860"/>
+      </w:tblGrid>
+      <w:tr>
+        <w:tblPrEx>
+          <w:tblCellMar>
+            <w:top w:w="0" w:type="dxa"/>
+            <w:bottom w:w="0" w:type="dxa"/>
+          </w:tblCellMar>
+        </w:tblPrEx>
+        <w:trPr>
+          <w:cantSplit/>
+          <w:tblHeader/>
+        </w:trPr>
+        <w:tc>
+          <w:tcPr>
+            <w:tcW w:w="3500" w:type="dxa"/>
+            <w:tcBorders>
+              <w:top w:val="single" w:sz="1" w:space="0" w:color="CCCCCC"/>
+              <w:left w:val="single" w:sz="1" w:space="0" w:color="CCCCCC"/>
+              <w:bottom w:val="single" w:sz="1" w:space="0" w:color="CCCCCC"/>
+              <w:right w:val="single" w:sz="1" w:space="0" w:color="CCCCCC"/>
+            </w:tcBorders>
+            <w:shd w:val="clear" w:color="auto" w:fill="002D72"/>
+            <w:tcMar>
+              <w:top w:w="100" w:type="dxa"/>
+              <w:left w:w="140" w:type="dxa"/>
+              <w:bottom w:w="100" w:type="dxa"/>
+              <w:right w:w="140" w:type="dxa"/>
+            </w:tcMar>
+            <w:vAlign w:val="center"/>
+          </w:tcPr>
+          <w:p>
+            <w:pPr>
+              <w:spacing w:after="0"/>
+            </w:pPr>
+            <w:r>
+              <w:rPr>
+                <w:b/>
+                <w:bCs/>
+                <w:color w:val="FFFFFF"/>
+                <w:sz w:val="20"/>
+                <w:szCs w:val="20"/>
+              </w:rPr>
+              <w:t>Change</w:t>
+            </w:r>
+          </w:p>
+        </w:tc>
+        <w:tc>
+          <w:tcPr>
+            <w:tcW w:w="5860" w:type="dxa"/>
+            <w:tcBorders>
+              <w:top w:val="single" w:sz="1" w:space="0" w:color="CCCCCC"/>
+              <w:left w:val="single" w:sz="1" w:space="0" w:color="CCCCCC"/>
+              <w:bottom w:val="single" w:sz="1" w:space="0" w:color="CCCCCC"/>
+              <w:right w:val="single" w:sz="1" w:space="0" w:color="CCCCCC"/>
+            </w:tcBorders>
+            <w:shd w:val="clear" w:color="auto" w:fill="002D72"/>
+            <w:tcMar>
+              <w:top w:w="100" w:type="dxa"/>
+              <w:left w:w="140" w:type="dxa"/>
+              <w:bottom w:w="100" w:type="dxa"/>
+              <w:right w:w="140" w:type="dxa"/>
+            </w:tcMar>
+            <w:vAlign w:val="center"/>
+          </w:tcPr>
+          <w:p>
+            <w:pPr>
+              <w:spacing w:after="0"/>
+            </w:pPr>
+            <w:r>
+              <w:rPr>
+                <w:b/>
+                <w:bCs/>
+                <w:color w:val="FFFFFF"/>
+                <w:sz w:val="20"/>
+                <w:szCs w:val="20"/>
+              </w:rPr>
+              <w:t>Rationale</w:t>
+            </w:r>
+          </w:p>
+        </w:tc>
+      </w:tr>
+      <w:tr>
+        <w:tblPrEx>
+          <w:tblCellMar>
+            <w:top w:w="0" w:type="dxa"/>
+            <w:bottom w:w="0" w:type="dxa"/>
+          </w:tblCellMar>
+        </w:tblPrEx>
+        <w:trPr>
+          <w:cantSplit/>
+        </w:trPr>
+        <w:tc>
+          <w:tcPr>
+            <w:tcW w:w="3500" w:type="dxa"/>
+            <w:tcBorders>
+              <w:top w:val="single" w:sz="1" w:space="0" w:color="CCCCCC"/>
+              <w:left w:val="single" w:sz="1" w:space="0" w:color="CCCCCC"/>
+              <w:bottom w:val="single" w:sz="1" w:space="0" w:color="CCCCCC"/>
+              <w:right w:val="single" w:sz="1" w:space="0" w:color="CCCCCC"/>
+            </w:tcBorders>
+            <w:tcMar>
+              <w:top w:w="100" w:type="dxa"/>
+              <w:left w:w="140" w:type="dxa"/>
+              <w:bottom w:w="100" w:type="dxa"/>
+              <w:right w:w="140" w:type="dxa"/>
+            </w:tcMar>
+          </w:tcPr>
+          <w:p>
+            <w:pPr>
+              <w:spacing w:after="0" w:line="252" w:lineRule="auto"/>
+            </w:pPr>
+            <w:r>
+              <w:rPr>
+                <w:sz w:val="20"/>
+                <w:szCs w:val="20"/>
+              </w:rPr>
+              <w:t xml:space="preserve">Added individual headshot photos for all lab members, extracted to external image files</w:t>
+            </w:r>
+          </w:p>
+        </w:tc>
+        <w:tc>
+          <w:tcPr>
+            <w:tcW w:w="5860" w:type="dxa"/>
+            <w:tcBorders>
+              <w:top w:val="single" w:sz="1" w:space="0" w:color="CCCCCC"/>
+              <w:left w:val="single" w:sz="1" w:space="0" w:color="CCCCCC"/>
+              <w:bottom w:val="single" w:sz="1" w:space="0" w:color="CCCCCC"/>
+              <w:right w:val="single" w:sz="1" w:space="0" w:color="CCCCCC"/>
+            </w:tcBorders>
+            <w:tcMar>
+              <w:top w:w="100" w:type="dxa"/>
+              <w:left w:w="140" w:type="dxa"/>
+              <w:bottom w:w="100" w:type="dxa"/>
+              <w:right w:w="140" w:type="dxa"/>
+            </w:tcMar>
+          </w:tcPr>
+          <w:p>
+            <w:pPr>
+              <w:spacing w:after="0" w:line="252" w:lineRule="auto"/>
+            </w:pPr>
+            <w:r>
+              <w:rPr>
+                <w:sz w:val="20"/>
+                <w:szCs w:val="20"/>
+              </w:rPr>
+              <w:t xml:space="preserve">Previously, member cards had no photos or used embedded base64 images (bloating the HTML to ~13 MB). External image files allow right-click saving, faster page loads, and easier updates when team composition changes</w:t>
+            </w:r>
+          </w:p>
+        </w:tc>
+      </w:tr>
+      <w:tr>
+        <w:tblPrEx>
+          <w:tblCellMar>
+            <w:top w:w="0" w:type="dxa"/>
+            <w:bottom w:w="0" w:type="dxa"/>
+          </w:tblCellMar>
+        </w:tblPrEx>
+        <w:trPr>
+          <w:cantSplit/>
+        </w:trPr>
+        <w:tc>
+          <w:tcPr>
+            <w:tcW w:w="3500" w:type="dxa"/>
+            <w:tcBorders>
+              <w:top w:val="single" w:sz="1" w:space="0" w:color="CCCCCC"/>
+              <w:left w:val="single" w:sz="1" w:space="0" w:color="CCCCCC"/>
+              <w:bottom w:val="single" w:sz="1" w:space="0" w:color="CCCCCC"/>
+              <w:right w:val="single" w:sz="1" w:space="0" w:color="CCCCCC"/>
+            </w:tcBorders>
+            <w:tcMar>
+              <w:top w:w="100" w:type="dxa"/>
+              <w:left w:w="140" w:type="dxa"/>
+              <w:bottom w:w="100" w:type="dxa"/>
+              <w:right w:w="140" w:type="dxa"/>
+            </w:tcMar>
+          </w:tcPr>
+          <w:p>
+            <w:pPr>
+              <w:spacing w:after="0" w:line="252" w:lineRule="auto"/>
+            </w:pPr>
+            <w:r>
+              <w:rPr>
+                <w:sz w:val="20"/>
+                <w:szCs w:val="20"/>
+              </w:rPr>
+              <w:t xml:space="preserve">Added keyword research-area tags (bubble labels) to researcher and student bios</w:t>
+            </w:r>
+          </w:p>
+        </w:tc>
+        <w:tc>
+          <w:tcPr>
+            <w:tcW w:w="5860" w:type="dxa"/>
+            <w:tcBorders>
+              <w:top w:val="single" w:sz="1" w:space="0" w:color="CCCCCC"/>
+              <w:left w:val="single" w:sz="1" w:space="0" w:color="CCCCCC"/>
+              <w:bottom w:val="single" w:sz="1" w:space="0" w:color="CCCCCC"/>
+              <w:right w:val="single" w:sz="1" w:space="0" w:color="CCCCCC"/>
+            </w:tcBorders>
+            <w:tcMar>
+              <w:top w:w="100" w:type="dxa"/>
+              <w:left w:w="140" w:type="dxa"/>
+              <w:bottom w:w="100" w:type="dxa"/>
+              <w:right w:w="140" w:type="dxa"/>
+            </w:tcMar>
+          </w:tcPr>
+          <w:p>
+            <w:pPr>
+              <w:spacing w:after="0" w:line="252" w:lineRule="auto"/>
+            </w:pPr>
+            <w:r>
+              <w:rPr>
+                <w:sz w:val="20"/>
+                <w:szCs w:val="20"/>
+              </w:rPr>
+              <w:t xml:space="preserve">Visitors — especially prospective students and collaborators — can scan research interests at a glance without reading each full bio. Keywords were removed from staff members (Drew, Chris, Muhamed) where they are not applicable</w:t>
+            </w:r>
+          </w:p>
+        </w:tc>
+      </w:tr>
+      <w:tr>
+        <w:tblPrEx>
+          <w:tblCellMar>
+            <w:top w:w="0" w:type="dxa"/>
+            <w:bottom w:w="0" w:type="dxa"/>
+          </w:tblCellMar>
+        </w:tblPrEx>
+        <w:trPr>
+          <w:cantSplit/>
+        </w:trPr>
+        <w:tc>
+          <w:tcPr>
+            <w:tcW w:w="3500" w:type="dxa"/>
+            <w:tcBorders>
+              <w:top w:val="single" w:sz="1" w:space="0" w:color="CCCCCC"/>
+              <w:left w:val="single" w:sz="1" w:space="0" w:color="CCCCCC"/>
+              <w:bottom w:val="single" w:sz="1" w:space="0" w:color="CCCCCC"/>
+              <w:right w:val="single" w:sz="1" w:space="0" w:color="CCCCCC"/>
+            </w:tcBorders>
+            <w:tcMar>
+              <w:top w:w="100" w:type="dxa"/>
+              <w:left w:w="140" w:type="dxa"/>
+              <w:bottom w:w="100" w:type="dxa"/>
+              <w:right w:w="140" w:type="dxa"/>
+            </w:tcMar>
+          </w:tcPr>
+          <w:p>
+            <w:pPr>
+              <w:spacing w:after="0" w:line="252" w:lineRule="auto"/>
+            </w:pPr>
+            <w:r>
+              <w:rPr>
+                <w:sz w:val="20"/>
+                <w:szCs w:val="20"/>
+              </w:rPr>
+              <w:t xml:space="preserve">Updated 9 lab member profiles with richer bios, corrected links, and additional social/academic links (Google Scholar, Bluesky, GitHub, X)</w:t>
+            </w:r>
+          </w:p>
+        </w:tc>
+        <w:tc>
+          <w:tcPr>
+            <w:tcW w:w="5860" w:type="dxa"/>
+            <w:tcBorders>
+              <w:top w:val="single" w:sz="1" w:space="0" w:color="CCCCCC"/>
+              <w:left w:val="single" w:sz="1" w:space="0" w:color="CCCCCC"/>
+              <w:bottom w:val="single" w:sz="1" w:space="0" w:color="CCCCCC"/>
+              <w:right w:val="single" w:sz="1" w:space="0" w:color="CCCCCC"/>
+            </w:tcBorders>
+            <w:tcMar>
+              <w:top w:w="100" w:type="dxa"/>
+              <w:left w:w="140" w:type="dxa"/>
+              <w:bottom w:w="100" w:type="dxa"/>
+              <w:right w:w="140" w:type="dxa"/>
+            </w:tcMar>
+          </w:tcPr>
+          <w:p>
+            <w:pPr>
+              <w:spacing w:after="0" w:line="252" w:lineRule="auto"/>
+            </w:pPr>
+            <w:r>
+              <w:rPr>
+                <w:sz w:val="20"/>
+                <w:szCs w:val="20"/>
+              </w:rPr>
+              <w:t xml:space="preserve">The original bios were minimal placeholders. Survey responses from lab members provided accurate, detailed research descriptions and preferred links. Updated members: Andrea Wynn, Binze Li, Kuleen Sasse, Matthew Renze, Konstantinos Mitsopoulos, Maria Ryskina, Rebekah Gelpí, Seokhyun (Nathan) Baek, and Austen Liao</w:t>
+            </w:r>
+          </w:p>
+        </w:tc>
+      </w:tr>
+      <w:tr>
+        <w:tblPrEx>
+          <w:tblCellMar>
+            <w:top w:w="0" w:type="dxa"/>
+            <w:bottom w:w="0" w:type="dxa"/>
+          </w:tblCellMar>
+        </w:tblPrEx>
+        <w:trPr>
+          <w:cantSplit/>
+        </w:trPr>
+        <w:tc>
+          <w:tcPr>
+            <w:tcW w:w="3500" w:type="dxa"/>
+            <w:tcBorders>
+              <w:top w:val="single" w:sz="1" w:space="0" w:color="CCCCCC"/>
+              <w:left w:val="single" w:sz="1" w:space="0" w:color="CCCCCC"/>
+              <w:bottom w:val="single" w:sz="1" w:space="0" w:color="CCCCCC"/>
+              <w:right w:val="single" w:sz="1" w:space="0" w:color="CCCCCC"/>
+            </w:tcBorders>
+            <w:tcMar>
+              <w:top w:w="100" w:type="dxa"/>
+              <w:left w:w="140" w:type="dxa"/>
+              <w:bottom w:w="100" w:type="dxa"/>
+              <w:right w:w="140" w:type="dxa"/>
+            </w:tcMar>
+          </w:tcPr>
+          <w:p>
+            <w:pPr>
+              <w:spacing w:after="0" w:line="252" w:lineRule="auto"/>
+            </w:pPr>
+            <w:r>
+              <w:rPr>
+                <w:sz w:val="20"/>
+                <w:szCs w:val="20"/>
+              </w:rPr>
+              <w:t xml:space="preserve">Added new lab member Navya Mehrotra (Research Intern, BDP Summer Program) with bio, headshot, links, and keyword tags</w:t>
+            </w:r>
+          </w:p>
+        </w:tc>
+        <w:tc>
+          <w:tcPr>
+            <w:tcW w:w="5860" w:type="dxa"/>
+            <w:tcBorders>
+              <w:top w:val="single" w:sz="1" w:space="0" w:color="CCCCCC"/>
+              <w:left w:val="single" w:sz="1" w:space="0" w:color="CCCCCC"/>
+              <w:bottom w:val="single" w:sz="1" w:space="0" w:color="CCCCCC"/>
+              <w:right w:val="single" w:sz="1" w:space="0" w:color="CCCCCC"/>
+            </w:tcBorders>
+            <w:tcMar>
+              <w:top w:w="100" w:type="dxa"/>
+              <w:left w:w="140" w:type="dxa"/>
+              <w:bottom w:w="100" w:type="dxa"/>
+              <w:right w:w="140" w:type="dxa"/>
+            </w:tcMar>
+          </w:tcPr>
+          <w:p>
+            <w:pPr>
+              <w:spacing w:after="0" w:line="252" w:lineRule="auto"/>
+            </w:pPr>
+            <w:r>
+              <w:rPr>
+                <w:sz w:val="20"/>
+                <w:szCs w:val="20"/>
+              </w:rPr>
+              <w:t xml:space="preserve">Navya joined the lab as a summer research intern and needed to be represented on the team page alongside existing members</w:t>
+            </w:r>
+          </w:p>
+        </w:tc>
+      </w:tr>
+      <w:tr>
+        <w:tblPrEx>
+          <w:tblCellMar>
+            <w:top w:w="0" w:type="dxa"/>
+            <w:bottom w:w="0" w:type="dxa"/>
+          </w:tblCellMar>
+        </w:tblPrEx>
+        <w:trPr>
+          <w:cantSplit/>
+        </w:trPr>
+        <w:tc>
+          <w:tcPr>
+            <w:tcW w:w="3500" w:type="dxa"/>
+            <w:tcBorders>
+              <w:top w:val="single" w:sz="1" w:space="0" w:color="CCCCCC"/>
+              <w:left w:val="single" w:sz="1" w:space="0" w:color="CCCCCC"/>
+              <w:bottom w:val="single" w:sz="1" w:space="0" w:color="CCCCCC"/>
+              <w:right w:val="single" w:sz="1" w:space="0" w:color="CCCCCC"/>
+            </w:tcBorders>
+            <w:tcMar>
+              <w:top w:w="100" w:type="dxa"/>
+              <w:left w:w="140" w:type="dxa"/>
+              <w:bottom w:w="100" w:type="dxa"/>
+              <w:right w:w="140" w:type="dxa"/>
+            </w:tcMar>
+          </w:tcPr>
+          <w:p>
+            <w:pPr>
+              <w:spacing w:after="0" w:line="252" w:lineRule="auto"/>
+            </w:pPr>
+            <w:r>
+              <w:rPr>
+                <w:sz w:val="20"/>
+                <w:szCs w:val="20"/>
+              </w:rPr>
+              <w:t xml:space="preserve">Added Normativity Lab group photo with caption "2026 Normativity Lab Retreat"</w:t>
+            </w:r>
+          </w:p>
+        </w:tc>
+        <w:tc>
+          <w:tcPr>
+            <w:tcW w:w="5860" w:type="dxa"/>
+            <w:tcBorders>
+              <w:top w:val="single" w:sz="1" w:space="0" w:color="CCCCCC"/>
+              <w:left w:val="single" w:sz="1" w:space="0" w:color="CCCCCC"/>
+              <w:bottom w:val="single" w:sz="1" w:space="0" w:color="CCCCCC"/>
+              <w:right w:val="single" w:sz="1" w:space="0" w:color="CCCCCC"/>
+            </w:tcBorders>
+            <w:tcMar>
+              <w:top w:w="100" w:type="dxa"/>
+              <w:left w:w="140" w:type="dxa"/>
+              <w:bottom w:w="100" w:type="dxa"/>
+              <w:right w:w="140" w:type="dxa"/>
+            </w:tcMar>
+          </w:tcPr>
+          <w:p>
+            <w:pPr>
+              <w:spacing w:after="0" w:line="252" w:lineRule="auto"/>
+            </w:pPr>
+            <w:r>
+              <w:rPr>
+                <w:sz w:val="20"/>
+                <w:szCs w:val="20"/>
+              </w:rPr>
+              <w:t xml:space="preserve">A team photo adds a human, approachable element to the page and signals an active, cohesive research group — important for prospective members and collaborators</w:t>
+            </w:r>
+          </w:p>
+        </w:tc>
+      </w:tr>
+      <w:tr>
+        <w:tblPrEx>
+          <w:tblCellMar>
+            <w:top w:w="0" w:type="dxa"/>
+            <w:bottom w:w="0" w:type="dxa"/>
+          </w:tblCellMar>
+        </w:tblPrEx>
+        <w:trPr>
+          <w:cantSplit/>
+        </w:trPr>
+        <w:tc>
+          <w:tcPr>
+            <w:tcW w:w="3500" w:type="dxa"/>
+            <w:tcBorders>
+              <w:top w:val="single" w:sz="1" w:space="0" w:color="CCCCCC"/>
+              <w:left w:val="single" w:sz="1" w:space="0" w:color="CCCCCC"/>
+              <w:bottom w:val="single" w:sz="1" w:space="0" w:color="CCCCCC"/>
+              <w:right w:val="single" w:sz="1" w:space="0" w:color="CCCCCC"/>
+            </w:tcBorders>
+            <w:tcMar>
+              <w:top w:w="100" w:type="dxa"/>
+              <w:left w:w="140" w:type="dxa"/>
+              <w:bottom w:w="100" w:type="dxa"/>
+              <w:right w:w="140" w:type="dxa"/>
+            </w:tcMar>
+          </w:tcPr>
+          <w:p>
+            <w:pPr>
+              <w:spacing w:after="0" w:line="252" w:lineRule="auto"/>
+            </w:pPr>
+            <w:r>
+              <w:rPr>
+                <w:sz w:val="20"/>
+                <w:szCs w:val="20"/>
+              </w:rPr>
+              <w:t xml:space="preserve">Added CHAI workshop group photo at bottom of page</w:t>
+            </w:r>
+          </w:p>
+        </w:tc>
+        <w:tc>
+          <w:tcPr>
+            <w:tcW w:w="5860" w:type="dxa"/>
+            <w:tcBorders>
+              <w:top w:val="single" w:sz="1" w:space="0" w:color="CCCCCC"/>
+              <w:left w:val="single" w:sz="1" w:space="0" w:color="CCCCCC"/>
+              <w:bottom w:val="single" w:sz="1" w:space="0" w:color="CCCCCC"/>
+              <w:right w:val="single" w:sz="1" w:space="0" w:color="CCCCCC"/>
+            </w:tcBorders>
+            <w:tcMar>
+              <w:top w:w="100" w:type="dxa"/>
+              <w:left w:w="140" w:type="dxa"/>
+              <w:bottom w:w="100" w:type="dxa"/>
+              <w:right w:w="140" w:type="dxa"/>
+            </w:tcMar>
+          </w:tcPr>
+          <w:p>
+            <w:pPr>
+              <w:spacing w:after="0" w:line="252" w:lineRule="auto"/>
+            </w:pPr>
+            <w:r>
+              <w:rPr>
+                <w:sz w:val="20"/>
+                <w:szCs w:val="20"/>
+              </w:rPr>
+              <w:t xml:space="preserve">Documents participation in the Center for Human-Compatible AI (CHAI) workshop and reinforces external collaboration</w:t>
+            </w:r>
+          </w:p>
+        </w:tc>
+      </w:tr>
+      <w:tr>
+        <w:tblPrEx>
+          <w:tblCellMar>
+            <w:top w:w="0" w:type="dxa"/>
+            <w:bottom w:w="0" w:type="dxa"/>
+          </w:tblCellMar>
+        </w:tblPrEx>
+        <w:trPr>
+          <w:cantSplit/>
+        </w:trPr>
+        <w:tc>
+          <w:tcPr>
+            <w:tcW w:w="3500" w:type="dxa"/>
+            <w:tcBorders>
+              <w:top w:val="single" w:sz="1" w:space="0" w:color="CCCCCC"/>
+              <w:left w:val="single" w:sz="1" w:space="0" w:color="CCCCCC"/>
+              <w:bottom w:val="single" w:sz="1" w:space="0" w:color="CCCCCC"/>
+              <w:right w:val="single" w:sz="1" w:space="0" w:color="CCCCCC"/>
+            </w:tcBorders>
+            <w:tcMar>
+              <w:top w:w="100" w:type="dxa"/>
+              <w:left w:w="140" w:type="dxa"/>
+              <w:bottom w:w="100" w:type="dxa"/>
+              <w:right w:w="140" w:type="dxa"/>
+            </w:tcMar>
+          </w:tcPr>
+          <w:p>
+            <w:pPr>
+              <w:spacing w:after="0" w:line="252" w:lineRule="auto"/>
+            </w:pPr>
+            <w:r>
+              <w:rPr>
+                <w:sz w:val="20"/>
+                <w:szCs w:val="20"/>
+              </w:rPr>
+              <w:t xml:space="preserve">Fixed broken personal website links for 8 lab members</w:t>
+            </w:r>
+          </w:p>
+        </w:tc>
+        <w:tc>
+          <w:tcPr>
+            <w:tcW w:w="5860" w:type="dxa"/>
+            <w:tcBorders>
+              <w:top w:val="single" w:sz="1" w:space="0" w:color="CCCCCC"/>
+              <w:left w:val="single" w:sz="1" w:space="0" w:color="CCCCCC"/>
+              <w:bottom w:val="single" w:sz="1" w:space="0" w:color="CCCCCC"/>
+              <w:right w:val="single" w:sz="1" w:space="0" w:color="CCCCCC"/>
+            </w:tcBorders>
+            <w:tcMar>
+              <w:top w:w="100" w:type="dxa"/>
+              <w:left w:w="140" w:type="dxa"/>
+              <w:bottom w:w="100" w:type="dxa"/>
+              <w:right w:w="140" w:type="dxa"/>
+            </w:tcMar>
+          </w:tcPr>
+          <w:p>
+            <w:pPr>
+              <w:spacing w:after="0" w:line="252" w:lineRule="auto"/>
+            </w:pPr>
+            <w:r>
+              <w:rPr>
+                <w:sz w:val="20"/>
+                <w:szCs w:val="20"/>
+              </w:rPr>
+              <w:t xml:space="preserve">Several members' original domain links had expired or redirected to parked pages. Updated to current GitHub Pages URLs so visitors reach actual content</w:t>
+            </w:r>
+          </w:p>
+        </w:tc>
+      </w:tr>
+      <w:tr>
+        <w:tblPrEx>
+          <w:tblCellMar>
+            <w:top w:w="0" w:type="dxa"/>
+            <w:bottom w:w="0" w:type="dxa"/>
+          </w:tblCellMar>
+        </w:tblPrEx>
+        <w:trPr>
+          <w:cantSplit/>
+        </w:trPr>
+        <w:tc>
+          <w:tcPr>
+            <w:tcW w:w="3500" w:type="dxa"/>
+            <w:tcBorders>
+              <w:top w:val="single" w:sz="1" w:space="0" w:color="CCCCCC"/>
+              <w:left w:val="single" w:sz="1" w:space="0" w:color="CCCCCC"/>
+              <w:bottom w:val="single" w:sz="1" w:space="0" w:color="CCCCCC"/>
+              <w:right w:val="single" w:sz="1" w:space="0" w:color="CCCCCC"/>
+            </w:tcBorders>
+            <w:tcMar>
+              <w:top w:w="100" w:type="dxa"/>
+              <w:left w:w="140" w:type="dxa"/>
+              <w:bottom w:w="100" w:type="dxa"/>
+              <w:right w:w="140" w:type="dxa"/>
+            </w:tcMar>
+          </w:tcPr>
+          <w:p>
+            <w:pPr>
+              <w:spacing w:after="0" w:line="252" w:lineRule="auto"/>
+            </w:pPr>
+            <w:r>
+              <w:rPr>
+                <w:sz w:val="20"/>
+                <w:szCs w:val="20"/>
+              </w:rPr>
+              <w:t xml:space="preserve">Added visible pronouns to card headers for members who opted in (Kuleen Sasse, Matthew Renze)</w:t>
+            </w:r>
+          </w:p>
+        </w:tc>
+        <w:tc>
+          <w:tcPr>
+            <w:tcW w:w="5860" w:type="dxa"/>
+            <w:tcBorders>
+              <w:top w:val="single" w:sz="1" w:space="0" w:color="CCCCCC"/>
+              <w:left w:val="single" w:sz="1" w:space="0" w:color="CCCCCC"/>
+              <w:bottom w:val="single" w:sz="1" w:space="0" w:color="CCCCCC"/>
+              <w:right w:val="single" w:sz="1" w:space="0" w:color="CCCCCC"/>
+            </w:tcBorders>
+            <w:tcMar>
+              <w:top w:w="100" w:type="dxa"/>
+              <w:left w:w="140" w:type="dxa"/>
+              <w:bottom w:w="100" w:type="dxa"/>
+              <w:right w:w="140" w:type="dxa"/>
+            </w:tcMar>
+          </w:tcPr>
+          <w:p>
+            <w:pPr>
+              <w:spacing w:after="0" w:line="252" w:lineRule="auto"/>
+            </w:pPr>
+            <w:r>
+              <w:rPr>
+                <w:sz w:val="20"/>
+                <w:szCs w:val="20"/>
+              </w:rPr>
+              <w:t xml:space="preserve">Respects members' preferences and signals an inclusive lab culture to prospective students and collaborators</w:t>
+            </w:r>
+          </w:p>
+        </w:tc>
+      </w:tr>
+    </w:tbl>
     <w:p>
       <w:pPr>
         <w:keepNext/>

</xml_diff>

<commit_message>
Trim Normativity Lab section to keyword tags and photos only
Keep only the three key changes: keyword research-area tags,
group photo, and CHAI workshop photo.

Co-Authored-By: Claude Opus 4.6 <noreply@anthropic.com>
Claude-Session: https://claude.ai/code/session_01EMrBifwqBFwrnxGh11cQvW
</commit_message>
<xml_diff>
--- a/Website_Content_Updates.docx
+++ b/Website_Content_Updates.docx
@@ -2186,7 +2186,7 @@
                 <w:sz w:val="20"/>
                 <w:szCs w:val="20"/>
               </w:rPr>
-              <w:t xml:space="preserve">Added individual headshot photos for all lab members, extracted to external image files</w:t>
+              <w:t xml:space="preserve">Added keyword research-area tags (bubble labels) to researcher and student bios</w:t>
             </w:r>
           </w:p>
         </w:tc>
@@ -2215,7 +2215,7 @@
                 <w:sz w:val="20"/>
                 <w:szCs w:val="20"/>
               </w:rPr>
-              <w:t xml:space="preserve">Previously, member cards had no photos or used embedded base64 images (bloating the HTML to ~13 MB). External image files allow right-click saving, faster page loads, and easier updates when team composition changes</w:t>
+              <w:t xml:space="preserve">Visitors — especially prospective students and collaborators — can scan research interests at a glance without reading each full bio. Keywords were removed from staff members (Drew, Chris, Muhamed) where they are not applicable</w:t>
             </w:r>
           </w:p>
         </w:tc>
@@ -2255,7 +2255,7 @@
                 <w:sz w:val="20"/>
                 <w:szCs w:val="20"/>
               </w:rPr>
-              <w:t xml:space="preserve">Added keyword research-area tags (bubble labels) to researcher and student bios</w:t>
+              <w:t xml:space="preserve">Added Normativity Lab group photo with caption "2026 Normativity Lab Retreat"</w:t>
             </w:r>
           </w:p>
         </w:tc>
@@ -2284,7 +2284,7 @@
                 <w:sz w:val="20"/>
                 <w:szCs w:val="20"/>
               </w:rPr>
-              <w:t xml:space="preserve">Visitors — especially prospective students and collaborators — can scan research interests at a glance without reading each full bio. Keywords were removed from staff members (Drew, Chris, Muhamed) where they are not applicable</w:t>
+              <w:t xml:space="preserve">A team photo adds a human, approachable element to the page and signals an active, cohesive research group — important for prospective members and collaborators</w:t>
             </w:r>
           </w:p>
         </w:tc>
@@ -2324,7 +2324,7 @@
                 <w:sz w:val="20"/>
                 <w:szCs w:val="20"/>
               </w:rPr>
-              <w:t xml:space="preserve">Updated 9 lab member profiles with richer bios, corrected links, and additional social/academic links (Google Scholar, Bluesky, GitHub, X)</w:t>
+              <w:t xml:space="preserve">Added CHAI workshop group photo at bottom of page</w:t>
             </w:r>
           </w:p>
         </w:tc>
@@ -2353,352 +2353,7 @@
                 <w:sz w:val="20"/>
                 <w:szCs w:val="20"/>
               </w:rPr>
-              <w:t xml:space="preserve">The original bios were minimal placeholders. Survey responses from lab members provided accurate, detailed research descriptions and preferred links. Updated members: Andrea Wynn, Binze Li, Kuleen Sasse, Matthew Renze, Konstantinos Mitsopoulos, Maria Ryskina, Rebekah Gelpí, Seokhyun (Nathan) Baek, and Austen Liao</w:t>
-            </w:r>
-          </w:p>
-        </w:tc>
-      </w:tr>
-      <w:tr>
-        <w:tblPrEx>
-          <w:tblCellMar>
-            <w:top w:w="0" w:type="dxa"/>
-            <w:bottom w:w="0" w:type="dxa"/>
-          </w:tblCellMar>
-        </w:tblPrEx>
-        <w:trPr>
-          <w:cantSplit/>
-        </w:trPr>
-        <w:tc>
-          <w:tcPr>
-            <w:tcW w:w="3500" w:type="dxa"/>
-            <w:tcBorders>
-              <w:top w:val="single" w:sz="1" w:space="0" w:color="CCCCCC"/>
-              <w:left w:val="single" w:sz="1" w:space="0" w:color="CCCCCC"/>
-              <w:bottom w:val="single" w:sz="1" w:space="0" w:color="CCCCCC"/>
-              <w:right w:val="single" w:sz="1" w:space="0" w:color="CCCCCC"/>
-            </w:tcBorders>
-            <w:tcMar>
-              <w:top w:w="100" w:type="dxa"/>
-              <w:left w:w="140" w:type="dxa"/>
-              <w:bottom w:w="100" w:type="dxa"/>
-              <w:right w:w="140" w:type="dxa"/>
-            </w:tcMar>
-          </w:tcPr>
-          <w:p>
-            <w:pPr>
-              <w:spacing w:after="0" w:line="252" w:lineRule="auto"/>
-            </w:pPr>
-            <w:r>
-              <w:rPr>
-                <w:sz w:val="20"/>
-                <w:szCs w:val="20"/>
-              </w:rPr>
-              <w:t xml:space="preserve">Added new lab member Navya Mehrotra (Research Intern, BDP Summer Program) with bio, headshot, links, and keyword tags</w:t>
-            </w:r>
-          </w:p>
-        </w:tc>
-        <w:tc>
-          <w:tcPr>
-            <w:tcW w:w="5860" w:type="dxa"/>
-            <w:tcBorders>
-              <w:top w:val="single" w:sz="1" w:space="0" w:color="CCCCCC"/>
-              <w:left w:val="single" w:sz="1" w:space="0" w:color="CCCCCC"/>
-              <w:bottom w:val="single" w:sz="1" w:space="0" w:color="CCCCCC"/>
-              <w:right w:val="single" w:sz="1" w:space="0" w:color="CCCCCC"/>
-            </w:tcBorders>
-            <w:tcMar>
-              <w:top w:w="100" w:type="dxa"/>
-              <w:left w:w="140" w:type="dxa"/>
-              <w:bottom w:w="100" w:type="dxa"/>
-              <w:right w:w="140" w:type="dxa"/>
-            </w:tcMar>
-          </w:tcPr>
-          <w:p>
-            <w:pPr>
-              <w:spacing w:after="0" w:line="252" w:lineRule="auto"/>
-            </w:pPr>
-            <w:r>
-              <w:rPr>
-                <w:sz w:val="20"/>
-                <w:szCs w:val="20"/>
-              </w:rPr>
-              <w:t xml:space="preserve">Navya joined the lab as a summer research intern and needed to be represented on the team page alongside existing members</w:t>
-            </w:r>
-          </w:p>
-        </w:tc>
-      </w:tr>
-      <w:tr>
-        <w:tblPrEx>
-          <w:tblCellMar>
-            <w:top w:w="0" w:type="dxa"/>
-            <w:bottom w:w="0" w:type="dxa"/>
-          </w:tblCellMar>
-        </w:tblPrEx>
-        <w:trPr>
-          <w:cantSplit/>
-        </w:trPr>
-        <w:tc>
-          <w:tcPr>
-            <w:tcW w:w="3500" w:type="dxa"/>
-            <w:tcBorders>
-              <w:top w:val="single" w:sz="1" w:space="0" w:color="CCCCCC"/>
-              <w:left w:val="single" w:sz="1" w:space="0" w:color="CCCCCC"/>
-              <w:bottom w:val="single" w:sz="1" w:space="0" w:color="CCCCCC"/>
-              <w:right w:val="single" w:sz="1" w:space="0" w:color="CCCCCC"/>
-            </w:tcBorders>
-            <w:tcMar>
-              <w:top w:w="100" w:type="dxa"/>
-              <w:left w:w="140" w:type="dxa"/>
-              <w:bottom w:w="100" w:type="dxa"/>
-              <w:right w:w="140" w:type="dxa"/>
-            </w:tcMar>
-          </w:tcPr>
-          <w:p>
-            <w:pPr>
-              <w:spacing w:after="0" w:line="252" w:lineRule="auto"/>
-            </w:pPr>
-            <w:r>
-              <w:rPr>
-                <w:sz w:val="20"/>
-                <w:szCs w:val="20"/>
-              </w:rPr>
-              <w:t xml:space="preserve">Added Normativity Lab group photo with caption "2026 Normativity Lab Retreat"</w:t>
-            </w:r>
-          </w:p>
-        </w:tc>
-        <w:tc>
-          <w:tcPr>
-            <w:tcW w:w="5860" w:type="dxa"/>
-            <w:tcBorders>
-              <w:top w:val="single" w:sz="1" w:space="0" w:color="CCCCCC"/>
-              <w:left w:val="single" w:sz="1" w:space="0" w:color="CCCCCC"/>
-              <w:bottom w:val="single" w:sz="1" w:space="0" w:color="CCCCCC"/>
-              <w:right w:val="single" w:sz="1" w:space="0" w:color="CCCCCC"/>
-            </w:tcBorders>
-            <w:tcMar>
-              <w:top w:w="100" w:type="dxa"/>
-              <w:left w:w="140" w:type="dxa"/>
-              <w:bottom w:w="100" w:type="dxa"/>
-              <w:right w:w="140" w:type="dxa"/>
-            </w:tcMar>
-          </w:tcPr>
-          <w:p>
-            <w:pPr>
-              <w:spacing w:after="0" w:line="252" w:lineRule="auto"/>
-            </w:pPr>
-            <w:r>
-              <w:rPr>
-                <w:sz w:val="20"/>
-                <w:szCs w:val="20"/>
-              </w:rPr>
-              <w:t xml:space="preserve">A team photo adds a human, approachable element to the page and signals an active, cohesive research group — important for prospective members and collaborators</w:t>
-            </w:r>
-          </w:p>
-        </w:tc>
-      </w:tr>
-      <w:tr>
-        <w:tblPrEx>
-          <w:tblCellMar>
-            <w:top w:w="0" w:type="dxa"/>
-            <w:bottom w:w="0" w:type="dxa"/>
-          </w:tblCellMar>
-        </w:tblPrEx>
-        <w:trPr>
-          <w:cantSplit/>
-        </w:trPr>
-        <w:tc>
-          <w:tcPr>
-            <w:tcW w:w="3500" w:type="dxa"/>
-            <w:tcBorders>
-              <w:top w:val="single" w:sz="1" w:space="0" w:color="CCCCCC"/>
-              <w:left w:val="single" w:sz="1" w:space="0" w:color="CCCCCC"/>
-              <w:bottom w:val="single" w:sz="1" w:space="0" w:color="CCCCCC"/>
-              <w:right w:val="single" w:sz="1" w:space="0" w:color="CCCCCC"/>
-            </w:tcBorders>
-            <w:tcMar>
-              <w:top w:w="100" w:type="dxa"/>
-              <w:left w:w="140" w:type="dxa"/>
-              <w:bottom w:w="100" w:type="dxa"/>
-              <w:right w:w="140" w:type="dxa"/>
-            </w:tcMar>
-          </w:tcPr>
-          <w:p>
-            <w:pPr>
-              <w:spacing w:after="0" w:line="252" w:lineRule="auto"/>
-            </w:pPr>
-            <w:r>
-              <w:rPr>
-                <w:sz w:val="20"/>
-                <w:szCs w:val="20"/>
-              </w:rPr>
-              <w:t xml:space="preserve">Added CHAI workshop group photo at bottom of page</w:t>
-            </w:r>
-          </w:p>
-        </w:tc>
-        <w:tc>
-          <w:tcPr>
-            <w:tcW w:w="5860" w:type="dxa"/>
-            <w:tcBorders>
-              <w:top w:val="single" w:sz="1" w:space="0" w:color="CCCCCC"/>
-              <w:left w:val="single" w:sz="1" w:space="0" w:color="CCCCCC"/>
-              <w:bottom w:val="single" w:sz="1" w:space="0" w:color="CCCCCC"/>
-              <w:right w:val="single" w:sz="1" w:space="0" w:color="CCCCCC"/>
-            </w:tcBorders>
-            <w:tcMar>
-              <w:top w:w="100" w:type="dxa"/>
-              <w:left w:w="140" w:type="dxa"/>
-              <w:bottom w:w="100" w:type="dxa"/>
-              <w:right w:w="140" w:type="dxa"/>
-            </w:tcMar>
-          </w:tcPr>
-          <w:p>
-            <w:pPr>
-              <w:spacing w:after="0" w:line="252" w:lineRule="auto"/>
-            </w:pPr>
-            <w:r>
-              <w:rPr>
-                <w:sz w:val="20"/>
-                <w:szCs w:val="20"/>
-              </w:rPr>
               <w:t xml:space="preserve">Documents participation in the Center for Human-Compatible AI (CHAI) workshop and reinforces external collaboration</w:t>
-            </w:r>
-          </w:p>
-        </w:tc>
-      </w:tr>
-      <w:tr>
-        <w:tblPrEx>
-          <w:tblCellMar>
-            <w:top w:w="0" w:type="dxa"/>
-            <w:bottom w:w="0" w:type="dxa"/>
-          </w:tblCellMar>
-        </w:tblPrEx>
-        <w:trPr>
-          <w:cantSplit/>
-        </w:trPr>
-        <w:tc>
-          <w:tcPr>
-            <w:tcW w:w="3500" w:type="dxa"/>
-            <w:tcBorders>
-              <w:top w:val="single" w:sz="1" w:space="0" w:color="CCCCCC"/>
-              <w:left w:val="single" w:sz="1" w:space="0" w:color="CCCCCC"/>
-              <w:bottom w:val="single" w:sz="1" w:space="0" w:color="CCCCCC"/>
-              <w:right w:val="single" w:sz="1" w:space="0" w:color="CCCCCC"/>
-            </w:tcBorders>
-            <w:tcMar>
-              <w:top w:w="100" w:type="dxa"/>
-              <w:left w:w="140" w:type="dxa"/>
-              <w:bottom w:w="100" w:type="dxa"/>
-              <w:right w:w="140" w:type="dxa"/>
-            </w:tcMar>
-          </w:tcPr>
-          <w:p>
-            <w:pPr>
-              <w:spacing w:after="0" w:line="252" w:lineRule="auto"/>
-            </w:pPr>
-            <w:r>
-              <w:rPr>
-                <w:sz w:val="20"/>
-                <w:szCs w:val="20"/>
-              </w:rPr>
-              <w:t xml:space="preserve">Fixed broken personal website links for 8 lab members</w:t>
-            </w:r>
-          </w:p>
-        </w:tc>
-        <w:tc>
-          <w:tcPr>
-            <w:tcW w:w="5860" w:type="dxa"/>
-            <w:tcBorders>
-              <w:top w:val="single" w:sz="1" w:space="0" w:color="CCCCCC"/>
-              <w:left w:val="single" w:sz="1" w:space="0" w:color="CCCCCC"/>
-              <w:bottom w:val="single" w:sz="1" w:space="0" w:color="CCCCCC"/>
-              <w:right w:val="single" w:sz="1" w:space="0" w:color="CCCCCC"/>
-            </w:tcBorders>
-            <w:tcMar>
-              <w:top w:w="100" w:type="dxa"/>
-              <w:left w:w="140" w:type="dxa"/>
-              <w:bottom w:w="100" w:type="dxa"/>
-              <w:right w:w="140" w:type="dxa"/>
-            </w:tcMar>
-          </w:tcPr>
-          <w:p>
-            <w:pPr>
-              <w:spacing w:after="0" w:line="252" w:lineRule="auto"/>
-            </w:pPr>
-            <w:r>
-              <w:rPr>
-                <w:sz w:val="20"/>
-                <w:szCs w:val="20"/>
-              </w:rPr>
-              <w:t xml:space="preserve">Several members' original domain links had expired or redirected to parked pages. Updated to current GitHub Pages URLs so visitors reach actual content</w:t>
-            </w:r>
-          </w:p>
-        </w:tc>
-      </w:tr>
-      <w:tr>
-        <w:tblPrEx>
-          <w:tblCellMar>
-            <w:top w:w="0" w:type="dxa"/>
-            <w:bottom w:w="0" w:type="dxa"/>
-          </w:tblCellMar>
-        </w:tblPrEx>
-        <w:trPr>
-          <w:cantSplit/>
-        </w:trPr>
-        <w:tc>
-          <w:tcPr>
-            <w:tcW w:w="3500" w:type="dxa"/>
-            <w:tcBorders>
-              <w:top w:val="single" w:sz="1" w:space="0" w:color="CCCCCC"/>
-              <w:left w:val="single" w:sz="1" w:space="0" w:color="CCCCCC"/>
-              <w:bottom w:val="single" w:sz="1" w:space="0" w:color="CCCCCC"/>
-              <w:right w:val="single" w:sz="1" w:space="0" w:color="CCCCCC"/>
-            </w:tcBorders>
-            <w:tcMar>
-              <w:top w:w="100" w:type="dxa"/>
-              <w:left w:w="140" w:type="dxa"/>
-              <w:bottom w:w="100" w:type="dxa"/>
-              <w:right w:w="140" w:type="dxa"/>
-            </w:tcMar>
-          </w:tcPr>
-          <w:p>
-            <w:pPr>
-              <w:spacing w:after="0" w:line="252" w:lineRule="auto"/>
-            </w:pPr>
-            <w:r>
-              <w:rPr>
-                <w:sz w:val="20"/>
-                <w:szCs w:val="20"/>
-              </w:rPr>
-              <w:t xml:space="preserve">Added visible pronouns to card headers for members who opted in (Kuleen Sasse, Matthew Renze)</w:t>
-            </w:r>
-          </w:p>
-        </w:tc>
-        <w:tc>
-          <w:tcPr>
-            <w:tcW w:w="5860" w:type="dxa"/>
-            <w:tcBorders>
-              <w:top w:val="single" w:sz="1" w:space="0" w:color="CCCCCC"/>
-              <w:left w:val="single" w:sz="1" w:space="0" w:color="CCCCCC"/>
-              <w:bottom w:val="single" w:sz="1" w:space="0" w:color="CCCCCC"/>
-              <w:right w:val="single" w:sz="1" w:space="0" w:color="CCCCCC"/>
-            </w:tcBorders>
-            <w:tcMar>
-              <w:top w:w="100" w:type="dxa"/>
-              <w:left w:w="140" w:type="dxa"/>
-              <w:bottom w:w="100" w:type="dxa"/>
-              <w:right w:w="140" w:type="dxa"/>
-            </w:tcMar>
-          </w:tcPr>
-          <w:p>
-            <w:pPr>
-              <w:spacing w:after="0" w:line="252" w:lineRule="auto"/>
-            </w:pPr>
-            <w:r>
-              <w:rPr>
-                <w:sz w:val="20"/>
-                <w:szCs w:val="20"/>
-              </w:rPr>
-              <w:t xml:space="preserve">Respects members' preferences and signals an inclusive lab culture to prospective students and collaborators</w:t>
             </w:r>
           </w:p>
         </w:tc>

</xml_diff>

<commit_message>
Combine group photo and CHAI photo into single changelog entry
Merged into one change emphasizing the human, approachable element
the photos bring to the page.

Co-Authored-By: Claude Opus 4.6 <noreply@anthropic.com>
Claude-Session: https://claude.ai/code/session_01EMrBifwqBFwrnxGh11cQvW
</commit_message>
<xml_diff>
--- a/Website_Content_Updates.docx
+++ b/Website_Content_Updates.docx
@@ -2255,7 +2255,7 @@
                 <w:sz w:val="20"/>
                 <w:szCs w:val="20"/>
               </w:rPr>
-              <w:t xml:space="preserve">Added Normativity Lab group photo with caption "2026 Normativity Lab Retreat"</w:t>
+              <w:t xml:space="preserve">Added Normativity Lab group photo and CHAI workshop group photo</w:t>
             </w:r>
           </w:p>
         </w:tc>
@@ -2284,76 +2284,7 @@
                 <w:sz w:val="20"/>
                 <w:szCs w:val="20"/>
               </w:rPr>
-              <w:t xml:space="preserve">A team photo adds a human, approachable element to the page and signals an active, cohesive research group — important for prospective members and collaborators</w:t>
-            </w:r>
-          </w:p>
-        </w:tc>
-      </w:tr>
-      <w:tr>
-        <w:tblPrEx>
-          <w:tblCellMar>
-            <w:top w:w="0" w:type="dxa"/>
-            <w:bottom w:w="0" w:type="dxa"/>
-          </w:tblCellMar>
-        </w:tblPrEx>
-        <w:trPr>
-          <w:cantSplit/>
-        </w:trPr>
-        <w:tc>
-          <w:tcPr>
-            <w:tcW w:w="3500" w:type="dxa"/>
-            <w:tcBorders>
-              <w:top w:val="single" w:sz="1" w:space="0" w:color="CCCCCC"/>
-              <w:left w:val="single" w:sz="1" w:space="0" w:color="CCCCCC"/>
-              <w:bottom w:val="single" w:sz="1" w:space="0" w:color="CCCCCC"/>
-              <w:right w:val="single" w:sz="1" w:space="0" w:color="CCCCCC"/>
-            </w:tcBorders>
-            <w:tcMar>
-              <w:top w:w="100" w:type="dxa"/>
-              <w:left w:w="140" w:type="dxa"/>
-              <w:bottom w:w="100" w:type="dxa"/>
-              <w:right w:w="140" w:type="dxa"/>
-            </w:tcMar>
-          </w:tcPr>
-          <w:p>
-            <w:pPr>
-              <w:spacing w:after="0" w:line="252" w:lineRule="auto"/>
-            </w:pPr>
-            <w:r>
-              <w:rPr>
-                <w:sz w:val="20"/>
-                <w:szCs w:val="20"/>
-              </w:rPr>
-              <w:t xml:space="preserve">Added CHAI workshop group photo at bottom of page</w:t>
-            </w:r>
-          </w:p>
-        </w:tc>
-        <w:tc>
-          <w:tcPr>
-            <w:tcW w:w="5860" w:type="dxa"/>
-            <w:tcBorders>
-              <w:top w:val="single" w:sz="1" w:space="0" w:color="CCCCCC"/>
-              <w:left w:val="single" w:sz="1" w:space="0" w:color="CCCCCC"/>
-              <w:bottom w:val="single" w:sz="1" w:space="0" w:color="CCCCCC"/>
-              <w:right w:val="single" w:sz="1" w:space="0" w:color="CCCCCC"/>
-            </w:tcBorders>
-            <w:tcMar>
-              <w:top w:w="100" w:type="dxa"/>
-              <w:left w:w="140" w:type="dxa"/>
-              <w:bottom w:w="100" w:type="dxa"/>
-              <w:right w:w="140" w:type="dxa"/>
-            </w:tcMar>
-          </w:tcPr>
-          <w:p>
-            <w:pPr>
-              <w:spacing w:after="0" w:line="252" w:lineRule="auto"/>
-            </w:pPr>
-            <w:r>
-              <w:rPr>
-                <w:sz w:val="20"/>
-                <w:szCs w:val="20"/>
-              </w:rPr>
-              <w:t xml:space="preserve">Documents participation in the Center for Human-Compatible AI (CHAI) workshop and reinforces external collaboration</w:t>
+              <w:t xml:space="preserve">Photos add a human, approachable element to the page and signal an active, cohesive research group — important for prospective lab members and collaborators</w:t>
             </w:r>
           </w:p>
         </w:tc>

</xml_diff>